<commit_message>
quy trinh quan ly gian hang va san pham
</commit_message>
<xml_diff>
--- a/docs/25410218_PhamVanHoang_QuyTrinhQuanLyGianHangVaSanPham.docx
+++ b/docs/25410218_PhamVanHoang_QuyTrinhQuanLyGianHangVaSanPham.docx
@@ -919,10 +919,10 @@
           <w:szCs w:val="26"/>
         </w:rPr>
         <w:drawing>
-          <wp:inline distT="0" distB="0" distL="0" distR="0" wp14:anchorId="4674B1BB" wp14:editId="0976ECF1">
-            <wp:extent cx="5943600" cy="4091305"/>
-            <wp:effectExtent l="0" t="0" r="0" b="4445"/>
-            <wp:docPr id="1501382711" name="Hình ảnh 1"/>
+          <wp:inline distT="0" distB="0" distL="0" distR="0" wp14:anchorId="1AEAFB47" wp14:editId="3DB1A90A">
+            <wp:extent cx="5943600" cy="4114800"/>
+            <wp:effectExtent l="0" t="0" r="0" b="0"/>
+            <wp:docPr id="1297062416" name="Hình ảnh 1"/>
             <wp:cNvGraphicFramePr>
               <a:graphicFrameLocks xmlns:a="http://schemas.openxmlformats.org/drawingml/2006/main" noChangeAspect="1"/>
             </wp:cNvGraphicFramePr>
@@ -930,7 +930,7 @@
               <a:graphicData uri="http://schemas.openxmlformats.org/drawingml/2006/picture">
                 <pic:pic xmlns:pic="http://schemas.openxmlformats.org/drawingml/2006/picture">
                   <pic:nvPicPr>
-                    <pic:cNvPr id="1501382711" name=""/>
+                    <pic:cNvPr id="1297062416" name=""/>
                     <pic:cNvPicPr/>
                   </pic:nvPicPr>
                   <pic:blipFill>
@@ -942,7 +942,7 @@
                   <pic:spPr>
                     <a:xfrm>
                       <a:off x="0" y="0"/>
-                      <a:ext cx="5943600" cy="4091305"/>
+                      <a:ext cx="5943600" cy="4114800"/>
                     </a:xfrm>
                     <a:prstGeom prst="rect">
                       <a:avLst/>
@@ -1058,6 +1058,7 @@
           <w:sz w:val="26"/>
           <w:szCs w:val="26"/>
         </w:rPr>
+        <w:lastRenderedPageBreak/>
         <w:t>Hệ thống tự động (Shopee AI Engine):</w:t>
       </w:r>
       <w:r>
@@ -1089,7 +1090,6 @@
           <w:sz w:val="26"/>
           <w:szCs w:val="26"/>
         </w:rPr>
-        <w:lastRenderedPageBreak/>
         <w:t>Đội ngũ kiểm duyệt (Moderation Team):</w:t>
       </w:r>
       <w:r>
@@ -6327,6 +6327,65 @@
       <w:pPr>
         <w:rPr>
           <w:rFonts w:ascii="Times New Roman" w:hAnsi="Times New Roman" w:cs="Times New Roman"/>
+          <w:sz w:val="26"/>
+          <w:szCs w:val="26"/>
+        </w:rPr>
+      </w:pPr>
+      <w:r>
+        <w:rPr>
+          <w:rFonts w:ascii="Times New Roman" w:hAnsi="Times New Roman" w:cs="Times New Roman"/>
+          <w:noProof/>
+          <w:sz w:val="26"/>
+          <w:szCs w:val="26"/>
+        </w:rPr>
+        <w:lastRenderedPageBreak/>
+        <w:drawing>
+          <wp:inline distT="0" distB="0" distL="0" distR="0" wp14:anchorId="07B1BBCF" wp14:editId="4507B55F">
+            <wp:extent cx="5943600" cy="4046855"/>
+            <wp:effectExtent l="0" t="0" r="0" b="0"/>
+            <wp:docPr id="1621120798" name="Hình ảnh 3"/>
+            <wp:cNvGraphicFramePr>
+              <a:graphicFrameLocks xmlns:a="http://schemas.openxmlformats.org/drawingml/2006/main" noChangeAspect="1"/>
+            </wp:cNvGraphicFramePr>
+            <a:graphic xmlns:a="http://schemas.openxmlformats.org/drawingml/2006/main">
+              <a:graphicData uri="http://schemas.openxmlformats.org/drawingml/2006/picture">
+                <pic:pic xmlns:pic="http://schemas.openxmlformats.org/drawingml/2006/picture">
+                  <pic:nvPicPr>
+                    <pic:cNvPr id="1621120798" name="Hình ảnh 1621120798"/>
+                    <pic:cNvPicPr/>
+                  </pic:nvPicPr>
+                  <pic:blipFill>
+                    <a:blip r:embed="rId8" cstate="print">
+                      <a:extLst>
+                        <a:ext uri="{28A0092B-C50C-407E-A947-70E740481C1C}">
+                          <a14:useLocalDpi xmlns:a14="http://schemas.microsoft.com/office/drawing/2010/main" val="0"/>
+                        </a:ext>
+                      </a:extLst>
+                    </a:blip>
+                    <a:stretch>
+                      <a:fillRect/>
+                    </a:stretch>
+                  </pic:blipFill>
+                  <pic:spPr>
+                    <a:xfrm>
+                      <a:off x="0" y="0"/>
+                      <a:ext cx="5943600" cy="4046855"/>
+                    </a:xfrm>
+                    <a:prstGeom prst="rect">
+                      <a:avLst/>
+                    </a:prstGeom>
+                  </pic:spPr>
+                </pic:pic>
+              </a:graphicData>
+            </a:graphic>
+          </wp:inline>
+        </w:drawing>
+      </w:r>
+    </w:p>
+    <w:p>
+      <w:pPr>
+        <w:rPr>
+          <w:rFonts w:ascii="Times New Roman" w:hAnsi="Times New Roman" w:cs="Times New Roman"/>
           <w:b/>
           <w:bCs/>
           <w:sz w:val="26"/>
@@ -6619,7 +6678,6 @@
           <w:sz w:val="26"/>
           <w:szCs w:val="26"/>
         </w:rPr>
-        <w:lastRenderedPageBreak/>
         <w:t xml:space="preserve">Gửi thông báo kết quả: </w:t>
       </w:r>
       <w:r>
@@ -6788,6 +6846,7 @@
           <w:sz w:val="26"/>
           <w:szCs w:val="26"/>
         </w:rPr>
+        <w:lastRenderedPageBreak/>
         <w:t xml:space="preserve">Thời gian trung bình chu kỳ (Cycle Time - </w:t>
       </w:r>
       <m:oMath>
@@ -7788,7 +7847,6 @@
               <w:sz w:val="26"/>
               <w:szCs w:val="26"/>
             </w:rPr>
-            <w:lastRenderedPageBreak/>
             <m:t>Cost Efficiency</m:t>
           </m:r>
           <m:r>
@@ -7994,6 +8052,7 @@
           <w:sz w:val="26"/>
           <w:szCs w:val="26"/>
         </w:rPr>
+        <w:lastRenderedPageBreak/>
         <w:t xml:space="preserve">Tỷ lệ nhập đủ trường bắt buộc ngay lần đầu: </w:t>
       </w:r>
       <w:r>
@@ -8729,7 +8788,6 @@
                 <w:sz w:val="26"/>
                 <w:szCs w:val="26"/>
               </w:rPr>
-              <w:lastRenderedPageBreak/>
               <w:t>Lỗi nhập liệu &amp; vi phạm từ khóa</w:t>
             </w:r>
           </w:p>
@@ -8845,6 +8903,7 @@
                 <w:sz w:val="26"/>
                 <w:szCs w:val="26"/>
               </w:rPr>
+              <w:lastRenderedPageBreak/>
               <w:t>Duyệt lại hồ sơ tốn thời gian</w:t>
             </w:r>
           </w:p>
@@ -12802,6 +12861,7 @@
   <w:style w:type="character" w:default="1" w:styleId="Phngmcinhcuaoanvn">
     <w:name w:val="Default Paragraph Font"/>
     <w:uiPriority w:val="1"/>
+    <w:semiHidden/>
     <w:unhideWhenUsed/>
   </w:style>
   <w:style w:type="table" w:default="1" w:styleId="BangThngthng">

</xml_diff>